<commit_message>
Add Sparky88 password protection overlay
</commit_message>
<xml_diff>
--- a/trip/Yellowstone_Confirmed_Guide.docx
+++ b/trip/Yellowstone_Confirmed_Guide.docx
@@ -7,12 +7,12 @@
         <w:pStyle w:val="Title"/>
       </w:pPr>
       <w:r>
-        <w:t>Yellowstone &amp; Grand Teton - Detailed Offline Guide</w:t>
+        <w:t>Yellowstone &amp; Grand Teton - Confirmed Offline Guide</w:t>
       </w:r>
     </w:p>
     <w:p>
       <w:r>
-        <w:t>This guide provides detailed, step-by-step information for each stop on your remaining days, so you don't miss any hidden gems (like the boardwalks around Old Faithful!). Since cell service is non-existent, keep this document open on your phone.</w:t>
+        <w:t>This guide provides detailed, step-by-step information for each stop. Since cell service is non-existent, keep this document open on your phone.</w:t>
       </w:r>
     </w:p>
     <w:p>
@@ -21,11 +21,6 @@
       </w:pPr>
       <w:r>
         <w:t>DAY 2: Hayden Valley &amp; Grand Canyon (North)</w:t>
-      </w:r>
-    </w:p>
-    <w:p>
-      <w:r>
-        <w:t>ANIMAL WATCHING: Perfect for cooler weather! The mist makes the canyon dramatic and brings the animals out in Hayden Valley.</w:t>
       </w:r>
     </w:p>
     <w:p>
@@ -38,9 +33,7 @@
     </w:p>
     <w:p>
       <w:r>
-        <w:t>- Logistics: Drive north from Grant Village. The valley spans several miles.</w:t>
-        <w:br/>
-        <w:t>- Details: Do not just drive straight through. Pull over at the "Alum Creek" or "Elk Antler Creek" pullouts. Turn off your car engine, roll down the windows, and just listen. You will likely see massive herds of bison, and if you use your binoculars along the tree line, you might spot grizzly bears or wolves.</w:t>
+        <w:t>- Logistics: Drive north from Grant Village. Pull over at the "Alum Creek" pullout. Turn off engine, roll down windows, use binoculars.</w:t>
       </w:r>
     </w:p>
     <w:p>
@@ -48,14 +41,12 @@
         <w:pStyle w:val="Heading2"/>
       </w:pPr>
       <w:r>
-        <w:t>2. Artist Point / South Rim (8:30 AM)</w:t>
+        <w:t>2. Artist Point (8:30 AM)</w:t>
       </w:r>
     </w:p>
     <w:p>
       <w:r>
-        <w:t>- Logistics: Drive to the South Rim drive of the Canyon and park at the end.</w:t>
-        <w:br/>
-        <w:t>- Details: A very short 0.1-mile paved walk takes you to Artist Point. This is the classic, sweeping view of the 308-foot Lower Falls plunging into the yellow canyon. No strenuous hiking required.</w:t>
+        <w:t>- Details: Short 0.1-mile paved walk. Breathtaking view of the 308-foot Lower Falls.</w:t>
       </w:r>
     </w:p>
     <w:p>
@@ -63,14 +54,12 @@
         <w:pStyle w:val="Heading2"/>
       </w:pPr>
       <w:r>
-        <w:t>3. Brink of the Lower Falls / North Rim (9:30 AM)</w:t>
+        <w:t>3. Brink of the Lower Falls (9:30 AM)</w:t>
       </w:r>
     </w:p>
     <w:p>
       <w:r>
-        <w:t>- Logistics: Drive to the North Rim drive.</w:t>
-        <w:br/>
-        <w:t>- Details: This is a steep trail! It zig-zags down 600 feet into the canyon. At the bottom, you stand on a platform literally inches from the top of the massive waterfall as it drops off the cliff. (Remember, you have to hike back UP those 600 feet, so take your time and drink water).</w:t>
+        <w:t>- Details: Steep trail down 600 feet to stand directly over the waterfall edge.</w:t>
       </w:r>
     </w:p>
     <w:p>
@@ -83,9 +72,7 @@
     </w:p>
     <w:p>
       <w:r>
-        <w:t>- Logistics: Located east of Fishing Bridge along the lake.</w:t>
-        <w:br/>
-        <w:t>- Details: A flat, 2.3-mile loop trail. It takes you through a dense pine forest and pops out onto a beautiful, wind-swept beach on Yellowstone Lake. *WARNING: If there is a thunderstorm, skip this. It is extremely exposed to lightning.*</w:t>
+        <w:t>- Details: Flat 2.3-mile loop to a beautiful beach on Yellowstone Lake.</w:t>
       </w:r>
     </w:p>
     <w:p>
@@ -97,8 +84,16 @@
       </w:r>
     </w:p>
     <w:p>
+      <w:pPr>
+        <w:pStyle w:val="Heading2"/>
+      </w:pPr>
       <w:r>
-        <w:t>MOUNTAIN DAY: A stunning drive south into the neighboring National Park.</w:t>
+        <w:t>1. Early Drive &amp; Oxbow Bend (7:45 AM)</w:t>
+      </w:r>
+    </w:p>
+    <w:p>
+      <w:r>
+        <w:t>- Logistics: Drive south out of Yellowstone. Stop quickly at Oxbow Bend in the morning mist—this is the #1 time/place to spot Moose drinking!</w:t>
       </w:r>
     </w:p>
     <w:p>
@@ -106,18 +101,12 @@
         <w:pStyle w:val="Heading2"/>
       </w:pPr>
       <w:r>
-        <w:t>1. Jenny Lake &amp; Hidden Falls (8:15 AM)</w:t>
+        <w:t>2. Jenny Lake &amp; Hidden Falls (8:30 AM)</w:t>
       </w:r>
     </w:p>
     <w:p>
       <w:r>
-        <w:t>- Logistics: Park at the Jenny Lake Visitor Center. Head straight to the boat dock.</w:t>
-        <w:br/>
-        <w:t>- The Boat: Take the $20 round-trip shuttle boat across the lake (saves 4 miles of walking).</w:t>
-        <w:br/>
-        <w:t>- The Hike: Once off the boat, follow the signs for a short, slightly uphill 0.5-mile hike to Hidden Falls (a beautiful cascading waterfall).</w:t>
-        <w:br/>
-        <w:t>- Optional Add-on: If you are feeling energetic, hike another steep 0.5 miles past the falls to Inspiration Point for a sweeping view over the lake.</w:t>
+        <w:t>- Logistics: We drive past everything else to get here before lines form. Take the $20 boat shuttle across, then hike 0.5mi up to Hidden Falls.</w:t>
       </w:r>
     </w:p>
     <w:p>
@@ -125,14 +114,12 @@
         <w:pStyle w:val="Heading2"/>
       </w:pPr>
       <w:r>
-        <w:t>2. Jackson Lake Lodge (12:00 PM)</w:t>
+        <w:t>3. Mormon Row Detour (10:30 AM)</w:t>
       </w:r>
     </w:p>
     <w:p>
       <w:r>
-        <w:t>- Logistics: This is your budget picnic spot.</w:t>
-        <w:br/>
-        <w:t>- The Secret: Do not just eat in the parking lot! Walk into the main lodge building, go up the main stairs, and enter the massive lounge. There are 60-foot floor-to-ceiling windows perfectly framing the Teton range. You can eat your sandwiches out on the back patio or just relax on the couches inside.</w:t>
+        <w:t>- Logistics: Drive east from Jenny Lake to see the famous Moulton Barns for the most iconic photos in the park.</w:t>
       </w:r>
     </w:p>
     <w:p>
@@ -140,14 +127,12 @@
         <w:pStyle w:val="Heading2"/>
       </w:pPr>
       <w:r>
-        <w:t>3. Signal Mountain Summit (2:00 PM)</w:t>
+        <w:t>4. Signal Mountain (12:00 PM)</w:t>
       </w:r>
     </w:p>
     <w:p>
       <w:r>
-        <w:t>- Logistics: Turn off the main road onto Signal Mountain Summit Road.</w:t>
-        <w:br/>
-        <w:t>- What to expect: You don't have to hike this! It's a narrow, paved 5-mile road that you drive all the way to the top. At the summit, you get a 360-degree view of the entire Jackson Hole valley and the Tetons.</w:t>
+        <w:t>- Logistics: Drive the narrow 5-mile paved road to the summit for a 360-degree view (no hiking required!).</w:t>
       </w:r>
     </w:p>
     <w:p>
@@ -155,14 +140,25 @@
         <w:pStyle w:val="Heading2"/>
       </w:pPr>
       <w:r>
-        <w:t>4. Oxbow Bend (4:00 PM)</w:t>
+        <w:t>5. Jackson Lake Lodge (1:30 PM)</w:t>
       </w:r>
     </w:p>
     <w:p>
       <w:r>
-        <w:t>- Logistics: Just a pullout on the side of the road (Highway 89).</w:t>
-        <w:br/>
-        <w:t>- What to expect: This is the most famous photograph spot in the park. Mt. Moran reflects perfectly in the Snake River. Bring your binoculars and scan the edges of the water—this is the #1 spot to see Moose feeding in the willows!</w:t>
+        <w:t>- Logistics: Go upstairs into the massive lounge to eat your lunch looking out the 60-foot windows.</w:t>
+      </w:r>
+    </w:p>
+    <w:p>
+      <w:pPr>
+        <w:pStyle w:val="Heading2"/>
+      </w:pPr>
+      <w:r>
+        <w:t>6. Oxbow Bend (4:00 PM)</w:t>
+      </w:r>
+    </w:p>
+    <w:p>
+      <w:r>
+        <w:t>- Logistics: One last chance to spot Moose on the way back north to Grant Village.</w:t>
       </w:r>
     </w:p>
     <w:p>
@@ -171,11 +167,6 @@
       </w:pPr>
       <w:r>
         <w:t>DAY 4: Mammoth Hot Springs, Lamar Valley &amp; Departure</w:t>
-      </w:r>
-    </w:p>
-    <w:p>
-      <w:r>
-        <w:t>THE ULTIMATE WILDLIFE FINALE: Adding Lamar Valley before you head home.</w:t>
       </w:r>
     </w:p>
     <w:p>
@@ -188,11 +179,7 @@
     </w:p>
     <w:p>
       <w:r>
-        <w:t xml:space="preserve">- Details: Unlike the geysers you saw yesterday, Mammoth is a mountain of travertine limestone terraces. </w:t>
-        <w:br/>
-        <w:t>- Lower Terraces: Park at the bottom and walk the boardwalks to see Palette Spring and Liberty Cap.</w:t>
-        <w:br/>
-        <w:t>- Upper Terraces: You can actually drive the 1.5-mile Upper Terrace Drive to see the top features without hiking.</w:t>
+        <w:t>- Details: Walk the lower boardwalks and drive the 1.5-mile Upper Terrace Drive.</w:t>
       </w:r>
     </w:p>
     <w:p>
@@ -205,9 +192,7 @@
     </w:p>
     <w:p>
       <w:r>
-        <w:t>- Logistics: Drive East from Mammoth towards the Northeast Entrance.</w:t>
-        <w:br/>
-        <w:t>- Details: This is the "Serengeti of North America". Pull over at any of the wide pullouts and use your binoculars. You are almost guaranteed to see thousands of bison, and this is the absolute best place in the world to spot wild wolves hunting in the distance.</w:t>
+        <w:t>- Details: The "Serengeti of North America". Best place in the world to spot wild wolves and massive bison herds.</w:t>
       </w:r>
     </w:p>
     <w:p>
@@ -220,9 +205,7 @@
     </w:p>
     <w:p>
       <w:r>
-        <w:t>- Logistics: Located in Gardiner, MT (North Entrance).</w:t>
-        <w:br/>
-        <w:t>- Details: A massive stone arch dedicated by Teddy Roosevelt in 1903. You can pull over and take a fantastic family photo in front of the "For the Benefit and Enjoyment of the People" inscription before you exit the park.</w:t>
+        <w:t>- Details: North Entrance arch dedicated by Teddy Roosevelt in 1903.</w:t>
       </w:r>
     </w:p>
     <w:sectPr>

</xml_diff>

<commit_message>
Revert "Add Sparky88 password protection overlay"
This reverts commit 040bc876f90af6ac5b3b69e223c021fa93c4058d.
</commit_message>
<xml_diff>
--- a/trip/Yellowstone_Confirmed_Guide.docx
+++ b/trip/Yellowstone_Confirmed_Guide.docx
@@ -7,12 +7,12 @@
         <w:pStyle w:val="Title"/>
       </w:pPr>
       <w:r>
-        <w:t>Yellowstone &amp; Grand Teton - Confirmed Offline Guide</w:t>
+        <w:t>Yellowstone &amp; Grand Teton - Detailed Offline Guide</w:t>
       </w:r>
     </w:p>
     <w:p>
       <w:r>
-        <w:t>This guide provides detailed, step-by-step information for each stop. Since cell service is non-existent, keep this document open on your phone.</w:t>
+        <w:t>This guide provides detailed, step-by-step information for each stop on your remaining days, so you don't miss any hidden gems (like the boardwalks around Old Faithful!). Since cell service is non-existent, keep this document open on your phone.</w:t>
       </w:r>
     </w:p>
     <w:p>
@@ -21,6 +21,11 @@
       </w:pPr>
       <w:r>
         <w:t>DAY 2: Hayden Valley &amp; Grand Canyon (North)</w:t>
+      </w:r>
+    </w:p>
+    <w:p>
+      <w:r>
+        <w:t>ANIMAL WATCHING: Perfect for cooler weather! The mist makes the canyon dramatic and brings the animals out in Hayden Valley.</w:t>
       </w:r>
     </w:p>
     <w:p>
@@ -33,7 +38,9 @@
     </w:p>
     <w:p>
       <w:r>
-        <w:t>- Logistics: Drive north from Grant Village. Pull over at the "Alum Creek" pullout. Turn off engine, roll down windows, use binoculars.</w:t>
+        <w:t>- Logistics: Drive north from Grant Village. The valley spans several miles.</w:t>
+        <w:br/>
+        <w:t>- Details: Do not just drive straight through. Pull over at the "Alum Creek" or "Elk Antler Creek" pullouts. Turn off your car engine, roll down the windows, and just listen. You will likely see massive herds of bison, and if you use your binoculars along the tree line, you might spot grizzly bears or wolves.</w:t>
       </w:r>
     </w:p>
     <w:p>
@@ -41,12 +48,14 @@
         <w:pStyle w:val="Heading2"/>
       </w:pPr>
       <w:r>
-        <w:t>2. Artist Point (8:30 AM)</w:t>
+        <w:t>2. Artist Point / South Rim (8:30 AM)</w:t>
       </w:r>
     </w:p>
     <w:p>
       <w:r>
-        <w:t>- Details: Short 0.1-mile paved walk. Breathtaking view of the 308-foot Lower Falls.</w:t>
+        <w:t>- Logistics: Drive to the South Rim drive of the Canyon and park at the end.</w:t>
+        <w:br/>
+        <w:t>- Details: A very short 0.1-mile paved walk takes you to Artist Point. This is the classic, sweeping view of the 308-foot Lower Falls plunging into the yellow canyon. No strenuous hiking required.</w:t>
       </w:r>
     </w:p>
     <w:p>
@@ -54,12 +63,14 @@
         <w:pStyle w:val="Heading2"/>
       </w:pPr>
       <w:r>
-        <w:t>3. Brink of the Lower Falls (9:30 AM)</w:t>
+        <w:t>3. Brink of the Lower Falls / North Rim (9:30 AM)</w:t>
       </w:r>
     </w:p>
     <w:p>
       <w:r>
-        <w:t>- Details: Steep trail down 600 feet to stand directly over the waterfall edge.</w:t>
+        <w:t>- Logistics: Drive to the North Rim drive.</w:t>
+        <w:br/>
+        <w:t>- Details: This is a steep trail! It zig-zags down 600 feet into the canyon. At the bottom, you stand on a platform literally inches from the top of the massive waterfall as it drops off the cliff. (Remember, you have to hike back UP those 600 feet, so take your time and drink water).</w:t>
       </w:r>
     </w:p>
     <w:p>
@@ -72,7 +83,9 @@
     </w:p>
     <w:p>
       <w:r>
-        <w:t>- Details: Flat 2.3-mile loop to a beautiful beach on Yellowstone Lake.</w:t>
+        <w:t>- Logistics: Located east of Fishing Bridge along the lake.</w:t>
+        <w:br/>
+        <w:t>- Details: A flat, 2.3-mile loop trail. It takes you through a dense pine forest and pops out onto a beautiful, wind-swept beach on Yellowstone Lake. *WARNING: If there is a thunderstorm, skip this. It is extremely exposed to lightning.*</w:t>
       </w:r>
     </w:p>
     <w:p>
@@ -84,16 +97,8 @@
       </w:r>
     </w:p>
     <w:p>
-      <w:pPr>
-        <w:pStyle w:val="Heading2"/>
-      </w:pPr>
       <w:r>
-        <w:t>1. Early Drive &amp; Oxbow Bend (7:45 AM)</w:t>
-      </w:r>
-    </w:p>
-    <w:p>
-      <w:r>
-        <w:t>- Logistics: Drive south out of Yellowstone. Stop quickly at Oxbow Bend in the morning mist—this is the #1 time/place to spot Moose drinking!</w:t>
+        <w:t>MOUNTAIN DAY: A stunning drive south into the neighboring National Park.</w:t>
       </w:r>
     </w:p>
     <w:p>
@@ -101,12 +106,18 @@
         <w:pStyle w:val="Heading2"/>
       </w:pPr>
       <w:r>
-        <w:t>2. Jenny Lake &amp; Hidden Falls (8:30 AM)</w:t>
+        <w:t>1. Jenny Lake &amp; Hidden Falls (8:15 AM)</w:t>
       </w:r>
     </w:p>
     <w:p>
       <w:r>
-        <w:t>- Logistics: We drive past everything else to get here before lines form. Take the $20 boat shuttle across, then hike 0.5mi up to Hidden Falls.</w:t>
+        <w:t>- Logistics: Park at the Jenny Lake Visitor Center. Head straight to the boat dock.</w:t>
+        <w:br/>
+        <w:t>- The Boat: Take the $20 round-trip shuttle boat across the lake (saves 4 miles of walking).</w:t>
+        <w:br/>
+        <w:t>- The Hike: Once off the boat, follow the signs for a short, slightly uphill 0.5-mile hike to Hidden Falls (a beautiful cascading waterfall).</w:t>
+        <w:br/>
+        <w:t>- Optional Add-on: If you are feeling energetic, hike another steep 0.5 miles past the falls to Inspiration Point for a sweeping view over the lake.</w:t>
       </w:r>
     </w:p>
     <w:p>
@@ -114,12 +125,14 @@
         <w:pStyle w:val="Heading2"/>
       </w:pPr>
       <w:r>
-        <w:t>3. Mormon Row Detour (10:30 AM)</w:t>
+        <w:t>2. Jackson Lake Lodge (12:00 PM)</w:t>
       </w:r>
     </w:p>
     <w:p>
       <w:r>
-        <w:t>- Logistics: Drive east from Jenny Lake to see the famous Moulton Barns for the most iconic photos in the park.</w:t>
+        <w:t>- Logistics: This is your budget picnic spot.</w:t>
+        <w:br/>
+        <w:t>- The Secret: Do not just eat in the parking lot! Walk into the main lodge building, go up the main stairs, and enter the massive lounge. There are 60-foot floor-to-ceiling windows perfectly framing the Teton range. You can eat your sandwiches out on the back patio or just relax on the couches inside.</w:t>
       </w:r>
     </w:p>
     <w:p>
@@ -127,12 +140,14 @@
         <w:pStyle w:val="Heading2"/>
       </w:pPr>
       <w:r>
-        <w:t>4. Signal Mountain (12:00 PM)</w:t>
+        <w:t>3. Signal Mountain Summit (2:00 PM)</w:t>
       </w:r>
     </w:p>
     <w:p>
       <w:r>
-        <w:t>- Logistics: Drive the narrow 5-mile paved road to the summit for a 360-degree view (no hiking required!).</w:t>
+        <w:t>- Logistics: Turn off the main road onto Signal Mountain Summit Road.</w:t>
+        <w:br/>
+        <w:t>- What to expect: You don't have to hike this! It's a narrow, paved 5-mile road that you drive all the way to the top. At the summit, you get a 360-degree view of the entire Jackson Hole valley and the Tetons.</w:t>
       </w:r>
     </w:p>
     <w:p>
@@ -140,25 +155,14 @@
         <w:pStyle w:val="Heading2"/>
       </w:pPr>
       <w:r>
-        <w:t>5. Jackson Lake Lodge (1:30 PM)</w:t>
+        <w:t>4. Oxbow Bend (4:00 PM)</w:t>
       </w:r>
     </w:p>
     <w:p>
       <w:r>
-        <w:t>- Logistics: Go upstairs into the massive lounge to eat your lunch looking out the 60-foot windows.</w:t>
-      </w:r>
-    </w:p>
-    <w:p>
-      <w:pPr>
-        <w:pStyle w:val="Heading2"/>
-      </w:pPr>
-      <w:r>
-        <w:t>6. Oxbow Bend (4:00 PM)</w:t>
-      </w:r>
-    </w:p>
-    <w:p>
-      <w:r>
-        <w:t>- Logistics: One last chance to spot Moose on the way back north to Grant Village.</w:t>
+        <w:t>- Logistics: Just a pullout on the side of the road (Highway 89).</w:t>
+        <w:br/>
+        <w:t>- What to expect: This is the most famous photograph spot in the park. Mt. Moran reflects perfectly in the Snake River. Bring your binoculars and scan the edges of the water—this is the #1 spot to see Moose feeding in the willows!</w:t>
       </w:r>
     </w:p>
     <w:p>
@@ -167,6 +171,11 @@
       </w:pPr>
       <w:r>
         <w:t>DAY 4: Mammoth Hot Springs, Lamar Valley &amp; Departure</w:t>
+      </w:r>
+    </w:p>
+    <w:p>
+      <w:r>
+        <w:t>THE ULTIMATE WILDLIFE FINALE: Adding Lamar Valley before you head home.</w:t>
       </w:r>
     </w:p>
     <w:p>
@@ -179,7 +188,11 @@
     </w:p>
     <w:p>
       <w:r>
-        <w:t>- Details: Walk the lower boardwalks and drive the 1.5-mile Upper Terrace Drive.</w:t>
+        <w:t xml:space="preserve">- Details: Unlike the geysers you saw yesterday, Mammoth is a mountain of travertine limestone terraces. </w:t>
+        <w:br/>
+        <w:t>- Lower Terraces: Park at the bottom and walk the boardwalks to see Palette Spring and Liberty Cap.</w:t>
+        <w:br/>
+        <w:t>- Upper Terraces: You can actually drive the 1.5-mile Upper Terrace Drive to see the top features without hiking.</w:t>
       </w:r>
     </w:p>
     <w:p>
@@ -192,7 +205,9 @@
     </w:p>
     <w:p>
       <w:r>
-        <w:t>- Details: The "Serengeti of North America". Best place in the world to spot wild wolves and massive bison herds.</w:t>
+        <w:t>- Logistics: Drive East from Mammoth towards the Northeast Entrance.</w:t>
+        <w:br/>
+        <w:t>- Details: This is the "Serengeti of North America". Pull over at any of the wide pullouts and use your binoculars. You are almost guaranteed to see thousands of bison, and this is the absolute best place in the world to spot wild wolves hunting in the distance.</w:t>
       </w:r>
     </w:p>
     <w:p>
@@ -205,7 +220,9 @@
     </w:p>
     <w:p>
       <w:r>
-        <w:t>- Details: North Entrance arch dedicated by Teddy Roosevelt in 1903.</w:t>
+        <w:t>- Logistics: Located in Gardiner, MT (North Entrance).</w:t>
+        <w:br/>
+        <w:t>- Details: A massive stone arch dedicated by Teddy Roosevelt in 1903. You can pull over and take a fantastic family photo in front of the "For the Benefit and Enjoyment of the People" inscription before you exit the park.</w:t>
       </w:r>
     </w:p>
     <w:sectPr>

</xml_diff>

<commit_message>
Optimize Day 4 route to eliminate 60 mile Mammoth-Lamar backtracking
</commit_message>
<xml_diff>
--- a/trip/Yellowstone_Confirmed_Guide.docx
+++ b/trip/Yellowstone_Confirmed_Guide.docx
@@ -7,12 +7,12 @@
         <w:pStyle w:val="Title"/>
       </w:pPr>
       <w:r>
-        <w:t>Yellowstone &amp; Grand Teton - Detailed Offline Guide</w:t>
+        <w:t>Yellowstone &amp; Grand Teton - Confirmed Offline Guide</w:t>
       </w:r>
     </w:p>
     <w:p>
       <w:r>
-        <w:t>This guide provides detailed, step-by-step information for each stop on your remaining days, so you don't miss any hidden gems (like the boardwalks around Old Faithful!). Since cell service is non-existent, keep this document open on your phone.</w:t>
+        <w:t>This guide provides detailed, step-by-step information for each stop. Since cell service is non-existent, keep this document open on your phone.</w:t>
       </w:r>
     </w:p>
     <w:p>
@@ -21,11 +21,6 @@
       </w:pPr>
       <w:r>
         <w:t>DAY 2: Hayden Valley &amp; Grand Canyon (North)</w:t>
-      </w:r>
-    </w:p>
-    <w:p>
-      <w:r>
-        <w:t>ANIMAL WATCHING: Perfect for cooler weather! The mist makes the canyon dramatic and brings the animals out in Hayden Valley.</w:t>
       </w:r>
     </w:p>
     <w:p>
@@ -38,9 +33,7 @@
     </w:p>
     <w:p>
       <w:r>
-        <w:t>- Logistics: Drive north from Grant Village. The valley spans several miles.</w:t>
-        <w:br/>
-        <w:t>- Details: Do not just drive straight through. Pull over at the "Alum Creek" or "Elk Antler Creek" pullouts. Turn off your car engine, roll down the windows, and just listen. You will likely see massive herds of bison, and if you use your binoculars along the tree line, you might spot grizzly bears or wolves.</w:t>
+        <w:t>- Logistics: Drive north from Grant Village. Pull over at the "Alum Creek" pullout. Turn off engine, roll down windows, use binoculars.</w:t>
       </w:r>
     </w:p>
     <w:p>
@@ -48,14 +41,12 @@
         <w:pStyle w:val="Heading2"/>
       </w:pPr>
       <w:r>
-        <w:t>2. Artist Point / South Rim (8:30 AM)</w:t>
+        <w:t>2. Artist Point (8:30 AM)</w:t>
       </w:r>
     </w:p>
     <w:p>
       <w:r>
-        <w:t>- Logistics: Drive to the South Rim drive of the Canyon and park at the end.</w:t>
-        <w:br/>
-        <w:t>- Details: A very short 0.1-mile paved walk takes you to Artist Point. This is the classic, sweeping view of the 308-foot Lower Falls plunging into the yellow canyon. No strenuous hiking required.</w:t>
+        <w:t>- Details: Short 0.1-mile paved walk. Breathtaking view of the 308-foot Lower Falls.</w:t>
       </w:r>
     </w:p>
     <w:p>
@@ -63,14 +54,12 @@
         <w:pStyle w:val="Heading2"/>
       </w:pPr>
       <w:r>
-        <w:t>3. Brink of the Lower Falls / North Rim (9:30 AM)</w:t>
+        <w:t>3. Brink of the Lower Falls (9:30 AM)</w:t>
       </w:r>
     </w:p>
     <w:p>
       <w:r>
-        <w:t>- Logistics: Drive to the North Rim drive.</w:t>
-        <w:br/>
-        <w:t>- Details: This is a steep trail! It zig-zags down 600 feet into the canyon. At the bottom, you stand on a platform literally inches from the top of the massive waterfall as it drops off the cliff. (Remember, you have to hike back UP those 600 feet, so take your time and drink water).</w:t>
+        <w:t>- Details: Steep trail down 600 feet to stand directly over the waterfall edge.</w:t>
       </w:r>
     </w:p>
     <w:p>
@@ -83,9 +72,7 @@
     </w:p>
     <w:p>
       <w:r>
-        <w:t>- Logistics: Located east of Fishing Bridge along the lake.</w:t>
-        <w:br/>
-        <w:t>- Details: A flat, 2.3-mile loop trail. It takes you through a dense pine forest and pops out onto a beautiful, wind-swept beach on Yellowstone Lake. *WARNING: If there is a thunderstorm, skip this. It is extremely exposed to lightning.*</w:t>
+        <w:t>- Details: Flat 2.3-mile loop to a beautiful beach on Yellowstone Lake.</w:t>
       </w:r>
     </w:p>
     <w:p>
@@ -97,8 +84,16 @@
       </w:r>
     </w:p>
     <w:p>
+      <w:pPr>
+        <w:pStyle w:val="Heading2"/>
+      </w:pPr>
       <w:r>
-        <w:t>MOUNTAIN DAY: A stunning drive south into the neighboring National Park.</w:t>
+        <w:t>1. Early Drive &amp; Oxbow Bend (7:45 AM)</w:t>
+      </w:r>
+    </w:p>
+    <w:p>
+      <w:r>
+        <w:t>- Logistics: Drive south out of Yellowstone. Stop quickly at Oxbow Bend in the morning mist—this is the #1 time/place to spot Moose drinking!</w:t>
       </w:r>
     </w:p>
     <w:p>
@@ -106,18 +101,12 @@
         <w:pStyle w:val="Heading2"/>
       </w:pPr>
       <w:r>
-        <w:t>1. Jenny Lake &amp; Hidden Falls (8:15 AM)</w:t>
+        <w:t>2. Jenny Lake &amp; Hidden Falls (8:30 AM)</w:t>
       </w:r>
     </w:p>
     <w:p>
       <w:r>
-        <w:t>- Logistics: Park at the Jenny Lake Visitor Center. Head straight to the boat dock.</w:t>
-        <w:br/>
-        <w:t>- The Boat: Take the $20 round-trip shuttle boat across the lake (saves 4 miles of walking).</w:t>
-        <w:br/>
-        <w:t>- The Hike: Once off the boat, follow the signs for a short, slightly uphill 0.5-mile hike to Hidden Falls (a beautiful cascading waterfall).</w:t>
-        <w:br/>
-        <w:t>- Optional Add-on: If you are feeling energetic, hike another steep 0.5 miles past the falls to Inspiration Point for a sweeping view over the lake.</w:t>
+        <w:t>- Logistics: We drive past everything else to get here before lines form. Take the $20 boat shuttle across, then hike 0.5mi up to Hidden Falls.</w:t>
       </w:r>
     </w:p>
     <w:p>
@@ -125,14 +114,12 @@
         <w:pStyle w:val="Heading2"/>
       </w:pPr>
       <w:r>
-        <w:t>2. Jackson Lake Lodge (12:00 PM)</w:t>
+        <w:t>3. Mormon Row Detour (10:30 AM)</w:t>
       </w:r>
     </w:p>
     <w:p>
       <w:r>
-        <w:t>- Logistics: This is your budget picnic spot.</w:t>
-        <w:br/>
-        <w:t>- The Secret: Do not just eat in the parking lot! Walk into the main lodge building, go up the main stairs, and enter the massive lounge. There are 60-foot floor-to-ceiling windows perfectly framing the Teton range. You can eat your sandwiches out on the back patio or just relax on the couches inside.</w:t>
+        <w:t>- Logistics: Drive east from Jenny Lake to see the famous Moulton Barns for the most iconic photos in the park.</w:t>
       </w:r>
     </w:p>
     <w:p>
@@ -140,14 +127,12 @@
         <w:pStyle w:val="Heading2"/>
       </w:pPr>
       <w:r>
-        <w:t>3. Signal Mountain Summit (2:00 PM)</w:t>
+        <w:t>4. Signal Mountain (12:00 PM)</w:t>
       </w:r>
     </w:p>
     <w:p>
       <w:r>
-        <w:t>- Logistics: Turn off the main road onto Signal Mountain Summit Road.</w:t>
-        <w:br/>
-        <w:t>- What to expect: You don't have to hike this! It's a narrow, paved 5-mile road that you drive all the way to the top. At the summit, you get a 360-degree view of the entire Jackson Hole valley and the Tetons.</w:t>
+        <w:t>- Logistics: Drive the narrow 5-mile paved road to the summit for a 360-degree view (no hiking required!).</w:t>
       </w:r>
     </w:p>
     <w:p>
@@ -155,14 +140,25 @@
         <w:pStyle w:val="Heading2"/>
       </w:pPr>
       <w:r>
-        <w:t>4. Oxbow Bend (4:00 PM)</w:t>
+        <w:t>5. Jackson Lake Lodge (1:30 PM)</w:t>
       </w:r>
     </w:p>
     <w:p>
       <w:r>
-        <w:t>- Logistics: Just a pullout on the side of the road (Highway 89).</w:t>
-        <w:br/>
-        <w:t>- What to expect: This is the most famous photograph spot in the park. Mt. Moran reflects perfectly in the Snake River. Bring your binoculars and scan the edges of the water—this is the #1 spot to see Moose feeding in the willows!</w:t>
+        <w:t>- Logistics: Go upstairs into the massive lounge to eat your lunch looking out the 60-foot windows.</w:t>
+      </w:r>
+    </w:p>
+    <w:p>
+      <w:pPr>
+        <w:pStyle w:val="Heading2"/>
+      </w:pPr>
+      <w:r>
+        <w:t>6. Oxbow Bend (4:00 PM)</w:t>
+      </w:r>
+    </w:p>
+    <w:p>
+      <w:r>
+        <w:t>- Logistics: One last chance to spot Moose on the way back north to Grant Village.</w:t>
       </w:r>
     </w:p>
     <w:p>
@@ -170,12 +166,12 @@
         <w:pStyle w:val="Heading1"/>
       </w:pPr>
       <w:r>
-        <w:t>DAY 4: Mammoth Hot Springs, Lamar Valley &amp; Departure</w:t>
+        <w:t>DAY 4: Lamar Valley, Mammoth Hot Springs &amp; Departure</w:t>
       </w:r>
     </w:p>
     <w:p>
       <w:r>
-        <w:t>THE ULTIMATE WILDLIFE FINALE: Adding Lamar Valley before you head home.</w:t>
+        <w:t>THE ULTIMATE EFFICIENCY FINALE: A linear exit without backtracking.</w:t>
       </w:r>
     </w:p>
     <w:p>
@@ -183,16 +179,12 @@
         <w:pStyle w:val="Heading2"/>
       </w:pPr>
       <w:r>
-        <w:t>1. Mammoth Hot Springs (9:00 AM)</w:t>
+        <w:t>1. Lamar Valley (9:30 AM)</w:t>
       </w:r>
     </w:p>
     <w:p>
       <w:r>
-        <w:t xml:space="preserve">- Details: Unlike the geysers you saw yesterday, Mammoth is a mountain of travertine limestone terraces. </w:t>
-        <w:br/>
-        <w:t>- Lower Terraces: Park at the bottom and walk the boardwalks to see Palette Spring and Liberty Cap.</w:t>
-        <w:br/>
-        <w:t>- Upper Terraces: You can actually drive the 1.5-mile Upper Terrace Drive to see the top features without hiking.</w:t>
+        <w:t>- Logistics: Drive north from Grant Village along the EASTERN half of the loop (past Canyon &amp; Tower). Arrive in Lamar Valley while it is still morning.</w:t>
       </w:r>
     </w:p>
     <w:p>
@@ -200,14 +192,12 @@
         <w:pStyle w:val="Heading2"/>
       </w:pPr>
       <w:r>
-        <w:t>2. Lamar Valley Detour (10:30 AM)</w:t>
+        <w:t>2. Mammoth Hot Springs (11:00 AM)</w:t>
       </w:r>
     </w:p>
     <w:p>
       <w:r>
-        <w:t>- Logistics: Drive East from Mammoth towards the Northeast Entrance.</w:t>
-        <w:br/>
-        <w:t>- Details: This is the "Serengeti of North America". Pull over at any of the wide pullouts and use your binoculars. You are almost guaranteed to see thousands of bison, and this is the absolute best place in the world to spot wild wolves hunting in the distance.</w:t>
+        <w:t>- Logistics: Drive west from Lamar to Mammoth. Walk the lower boardwalks and drive the 1.5-mile Upper Terrace Drive.</w:t>
       </w:r>
     </w:p>
     <w:p>
@@ -220,9 +210,7 @@
     </w:p>
     <w:p>
       <w:r>
-        <w:t>- Logistics: Located in Gardiner, MT (North Entrance).</w:t>
-        <w:br/>
-        <w:t>- Details: A massive stone arch dedicated by Teddy Roosevelt in 1903. You can pull over and take a fantastic family photo in front of the "For the Benefit and Enjoyment of the People" inscription before you exit the park.</w:t>
+        <w:t>- Logistics: Head north to the park exit. Take a photo under the massive 1903 stone arch.</w:t>
       </w:r>
     </w:p>
     <w:sectPr>

</xml_diff>

<commit_message>
Add specific Turo car return instructions at BZN airport
</commit_message>
<xml_diff>
--- a/trip/Yellowstone_Confirmed_Guide.docx
+++ b/trip/Yellowstone_Confirmed_Guide.docx
@@ -211,6 +211,24 @@
     <w:p>
       <w:r>
         <w:t>- Logistics: Head north to the park exit. Take a photo under the massive 1903 stone arch.</w:t>
+      </w:r>
+    </w:p>
+    <w:p>
+      <w:pPr>
+        <w:pStyle w:val="Heading2"/>
+      </w:pPr>
+      <w:r>
+        <w:t>4. Return Turo Rental at BZN (7:00 PM)</w:t>
+      </w:r>
+    </w:p>
+    <w:p>
+      <w:r>
+        <w:t>- Logistics: Fill up on gas. Follow rental car return signs at airport. Turn RIGHT into the rideshare/Turo lot (do not go to the parking garage!). Drive to end of row, turn left. Park in spot 38, 39, 40, or 42 (on left).</w:t>
+      </w:r>
+    </w:p>
+    <w:p>
+      <w:r>
+        <w:t>- IMPORTANT: Take a picture of the vehicle in its spot. Leave keys in center console. Leave the car UNLOCKED.</w:t>
       </w:r>
     </w:p>
     <w:sectPr>

</xml_diff>

<commit_message>
Add specific breakfast and lunch stops to Day 4
</commit_message>
<xml_diff>
--- a/trip/Yellowstone_Confirmed_Guide.docx
+++ b/trip/Yellowstone_Confirmed_Guide.docx
@@ -179,12 +179,12 @@
         <w:pStyle w:val="Heading2"/>
       </w:pPr>
       <w:r>
-        <w:t>1. Lamar Valley (9:30 AM)</w:t>
+        <w:t>1. Breakfast at Canyon Village (8:00 AM)</w:t>
       </w:r>
     </w:p>
     <w:p>
       <w:r>
-        <w:t>- Logistics: Drive north from Grant Village along the EASTERN half of the loop (past Canyon &amp; Tower). Arrive in Lamar Valley while it is still morning.</w:t>
+        <w:t>- Logistics: Leave Grant Village at 7am, skip breakfast there. Drive north to Canyon Village and grab hot breakfast/coffee at the Canyon Lodge Eatery on the way.</w:t>
       </w:r>
     </w:p>
     <w:p>
@@ -192,7 +192,20 @@
         <w:pStyle w:val="Heading2"/>
       </w:pPr>
       <w:r>
-        <w:t>2. Mammoth Hot Springs (11:00 AM)</w:t>
+        <w:t>2. Lamar Valley (10:00 AM)</w:t>
+      </w:r>
+    </w:p>
+    <w:p>
+      <w:r>
+        <w:t>- Logistics: Arrive in Lamar Valley while it is still morning.</w:t>
+      </w:r>
+    </w:p>
+    <w:p>
+      <w:pPr>
+        <w:pStyle w:val="Heading2"/>
+      </w:pPr>
+      <w:r>
+        <w:t>3. Mammoth Hot Springs (11:30 AM)</w:t>
       </w:r>
     </w:p>
     <w:p>
@@ -205,12 +218,12 @@
         <w:pStyle w:val="Heading2"/>
       </w:pPr>
       <w:r>
-        <w:t>3. Roosevelt Arch (12:30 PM)</w:t>
+        <w:t>4. Roosevelt Arch &amp; Gardiner Lunch (1:00 PM)</w:t>
       </w:r>
     </w:p>
     <w:p>
       <w:r>
-        <w:t>- Logistics: Head north to the park exit. Take a photo under the massive 1903 stone arch.</w:t>
+        <w:t>- Logistics: Head north to the park exit. Take a photo under the massive 1903 stone arch. Then eat lunch in Gardiner (Wonderland Cafe or Iron Horse Bar &amp; Grill) right outside the park.</w:t>
       </w:r>
     </w:p>
     <w:p>
@@ -218,7 +231,7 @@
         <w:pStyle w:val="Heading2"/>
       </w:pPr>
       <w:r>
-        <w:t>4. Return Turo Rental at BZN (7:00 PM)</w:t>
+        <w:t>5. Return Turo Rental at BZN (7:00 PM)</w:t>
       </w:r>
     </w:p>
     <w:p>

</xml_diff>